<commit_message>
Backup auto 2025-08-31 19:04:11
</commit_message>
<xml_diff>
--- a/ZZ échange avec Chatgpt/00000 prompt pour  Doc État du Projet.docx
+++ b/ZZ échange avec Chatgpt/00000 prompt pour  Doc État du Projet.docx
@@ -12,21 +12,7 @@
         <w:rPr>
           <w:bCs/>
         </w:rPr>
-        <w:t xml:space="preserve">Tu es mon secrétaire technique. Génère un **document </w:t>
-      </w:r>
-      <w:proofErr w:type="spellStart"/>
-      <w:r>
-        <w:rPr>
-          <w:bCs/>
-        </w:rPr>
-        <w:t>Markdown</w:t>
-      </w:r>
-      <w:proofErr w:type="spellEnd"/>
-      <w:r>
-        <w:rPr>
-          <w:bCs/>
-        </w:rPr>
-        <w:t xml:space="preserve"> unique** de synthèse de session pour le projet ci-dessous. N’ajoute aucune question. Si une information manque, **déduis prudemment** et note `{{à compléter}}`. Le document doit être **actionnable**, **sans digression**, et contenir des **annexes persistantes** (Glossaire + Registre des variables) à **fusionner** depuis la version précédente si elle est fournie.</w:t>
+        <w:t>Tu es mon secrétaire technique. Génère un **document Markdown unique** de synthèse de session pour le projet ci-dessous. N’ajoute aucune question. Si une information manque, **déduis prudemment** et note `{{à compléter}}`. Le document doit être **actionnable**, **sans digression**, et contenir des **annexes persistantes** (Glossaire + Registre des variables) à **fusionner** depuis la version précédente si elle est fournie.</w:t>
       </w:r>
     </w:p>
     <w:p>
@@ -59,143 +45,59 @@
         <w:rPr>
           <w:bCs/>
         </w:rPr>
-        <w:t>- Projet : {{</w:t>
+        <w:t>- Projet : {{nom_du_projet}} (ex: r&amp;K_Environnement)</w:t>
       </w:r>
-      <w:proofErr w:type="spellStart"/>
+    </w:p>
+    <w:p>
+      <w:pPr>
+        <w:rPr>
+          <w:bCs/>
+        </w:rPr>
+      </w:pPr>
       <w:r>
         <w:rPr>
           <w:bCs/>
         </w:rPr>
-        <w:t>nom_du_projet</w:t>
+        <w:t>- Session : {{YYYY-MM-DD}} — {{tag_session}} (ex: 2025-08-24 — S08)</w:t>
       </w:r>
-      <w:proofErr w:type="spellEnd"/>
+    </w:p>
+    <w:p>
+      <w:pPr>
+        <w:rPr>
+          <w:bCs/>
+        </w:rPr>
+      </w:pPr>
       <w:r>
         <w:rPr>
           <w:bCs/>
         </w:rPr>
-        <w:t xml:space="preserve">}} (ex: </w:t>
+        <w:t>- Objectif global : {{objectif_global}}</w:t>
       </w:r>
-      <w:proofErr w:type="spellStart"/>
+    </w:p>
+    <w:p>
+      <w:pPr>
+        <w:rPr>
+          <w:bCs/>
+        </w:rPr>
+      </w:pPr>
       <w:r>
         <w:rPr>
           <w:bCs/>
         </w:rPr>
-        <w:t>r&amp;K_Environnement</w:t>
+        <w:t>- Focus de la session : {{focus_du_jour}}</w:t>
       </w:r>
-      <w:proofErr w:type="spellEnd"/>
+    </w:p>
+    <w:p>
+      <w:pPr>
+        <w:rPr>
+          <w:bCs/>
+        </w:rPr>
+      </w:pPr>
       <w:r>
         <w:rPr>
           <w:bCs/>
         </w:rPr>
-        <w:t>)</w:t>
-      </w:r>
-    </w:p>
-    <w:p>
-      <w:pPr>
-        <w:rPr>
-          <w:bCs/>
-        </w:rPr>
-      </w:pPr>
-      <w:r>
-        <w:rPr>
-          <w:bCs/>
-        </w:rPr>
-        <w:t>- Session : {{YYYY-MM-DD}} — {{</w:t>
-      </w:r>
-      <w:proofErr w:type="spellStart"/>
-      <w:r>
-        <w:rPr>
-          <w:bCs/>
-        </w:rPr>
-        <w:t>tag_session</w:t>
-      </w:r>
-      <w:proofErr w:type="spellEnd"/>
-      <w:r>
-        <w:rPr>
-          <w:bCs/>
-        </w:rPr>
-        <w:t>}} (ex: 2025-08-24 — S08)</w:t>
-      </w:r>
-    </w:p>
-    <w:p>
-      <w:pPr>
-        <w:rPr>
-          <w:bCs/>
-        </w:rPr>
-      </w:pPr>
-      <w:r>
-        <w:rPr>
-          <w:bCs/>
-        </w:rPr>
-        <w:t>- Objectif global : {{</w:t>
-      </w:r>
-      <w:proofErr w:type="spellStart"/>
-      <w:r>
-        <w:rPr>
-          <w:bCs/>
-        </w:rPr>
-        <w:t>objectif_global</w:t>
-      </w:r>
-      <w:proofErr w:type="spellEnd"/>
-      <w:r>
-        <w:rPr>
-          <w:bCs/>
-        </w:rPr>
-        <w:t>}}</w:t>
-      </w:r>
-    </w:p>
-    <w:p>
-      <w:pPr>
-        <w:rPr>
-          <w:bCs/>
-        </w:rPr>
-      </w:pPr>
-      <w:r>
-        <w:rPr>
-          <w:bCs/>
-        </w:rPr>
-        <w:t>- Focus de la session : {{</w:t>
-      </w:r>
-      <w:proofErr w:type="spellStart"/>
-      <w:r>
-        <w:rPr>
-          <w:bCs/>
-        </w:rPr>
-        <w:t>focus_du_jour</w:t>
-      </w:r>
-      <w:proofErr w:type="spellEnd"/>
-      <w:r>
-        <w:rPr>
-          <w:bCs/>
-        </w:rPr>
-        <w:t>}}</w:t>
-      </w:r>
-    </w:p>
-    <w:p>
-      <w:pPr>
-        <w:rPr>
-          <w:bCs/>
-        </w:rPr>
-      </w:pPr>
-      <w:r>
-        <w:rPr>
-          <w:bCs/>
-        </w:rPr>
-        <w:t>- Ligne CONFIG cible (si connue) : {{</w:t>
-      </w:r>
-      <w:proofErr w:type="spellStart"/>
-      <w:r>
-        <w:rPr>
-          <w:bCs/>
-        </w:rPr>
-        <w:t>rowIndex</w:t>
-      </w:r>
-      <w:proofErr w:type="spellEnd"/>
-      <w:r>
-        <w:rPr>
-          <w:bCs/>
-        </w:rPr>
-        <w:t>}}</w:t>
+        <w:t>- Ligne CONFIG cible (si connue) : {{rowIndex}}</w:t>
       </w:r>
     </w:p>
     <w:p>
@@ -221,21 +123,7 @@
         <w:rPr>
           <w:bCs/>
         </w:rPr>
-        <w:t xml:space="preserve">- Contexte précédent : Je te fournis le *dernier </w:t>
-      </w:r>
-      <w:proofErr w:type="spellStart"/>
-      <w:r>
-        <w:rPr>
-          <w:bCs/>
-        </w:rPr>
-        <w:t>Markdown</w:t>
-      </w:r>
-      <w:proofErr w:type="spellEnd"/>
-      <w:r>
-        <w:rPr>
-          <w:bCs/>
-        </w:rPr>
-        <w:t>* à jour **si disponible**. Tu dois y puiser et **fusionner** Glossaire &amp; Registre des variables (voir règles de persistance).</w:t>
+        <w:t>- Contexte précédent : Je te fournis le *dernier Markdown* à jour **si disponible**. Tu dois y puiser et **fusionner** Glossaire &amp; Registre des variables (voir règles de persistance).</w:t>
       </w:r>
     </w:p>
     <w:p>
@@ -268,35 +156,7 @@
         <w:rPr>
           <w:bCs/>
         </w:rPr>
-        <w:t xml:space="preserve">- **Un seul fichier </w:t>
-      </w:r>
-      <w:proofErr w:type="spellStart"/>
-      <w:r>
-        <w:rPr>
-          <w:bCs/>
-        </w:rPr>
-        <w:t>Markdown</w:t>
-      </w:r>
-      <w:proofErr w:type="spellEnd"/>
-      <w:r>
-        <w:rPr>
-          <w:bCs/>
-        </w:rPr>
-        <w:t xml:space="preserve">**, structuré, clair, actionnable. Pas de texte hors </w:t>
-      </w:r>
-      <w:proofErr w:type="spellStart"/>
-      <w:r>
-        <w:rPr>
-          <w:bCs/>
-        </w:rPr>
-        <w:t>Markdown</w:t>
-      </w:r>
-      <w:proofErr w:type="spellEnd"/>
-      <w:r>
-        <w:rPr>
-          <w:bCs/>
-        </w:rPr>
-        <w:t>. Pas de questions.</w:t>
+        <w:t>- **Un seul fichier Markdown**, structuré, clair, actionnable. Pas de texte hors Markdown. Pas de questions.</w:t>
       </w:r>
     </w:p>
     <w:p>
@@ -446,63 +306,7 @@
         <w:rPr>
           <w:bCs/>
         </w:rPr>
-        <w:t xml:space="preserve">     - </w:t>
-      </w:r>
-      <w:proofErr w:type="spellStart"/>
-      <w:r>
-        <w:rPr>
-          <w:bCs/>
-        </w:rPr>
-        <w:t>Form</w:t>
-      </w:r>
-      <w:proofErr w:type="spellEnd"/>
-      <w:r>
-        <w:rPr>
-          <w:bCs/>
-        </w:rPr>
-        <w:t xml:space="preserve"> `</w:t>
-      </w:r>
-      <w:proofErr w:type="spellStart"/>
-      <w:r>
-        <w:rPr>
-          <w:bCs/>
-        </w:rPr>
-        <w:t>ID_Formulaire_Cible</w:t>
-      </w:r>
-      <w:proofErr w:type="spellEnd"/>
-      <w:r>
-        <w:rPr>
-          <w:bCs/>
-        </w:rPr>
-        <w:t xml:space="preserve">=...` • </w:t>
-      </w:r>
-      <w:proofErr w:type="spellStart"/>
-      <w:r>
-        <w:rPr>
-          <w:bCs/>
-        </w:rPr>
-        <w:t>Sheet</w:t>
-      </w:r>
-      <w:proofErr w:type="spellEnd"/>
-      <w:r>
-        <w:rPr>
-          <w:bCs/>
-        </w:rPr>
-        <w:t xml:space="preserve"> réponses `</w:t>
-      </w:r>
-      <w:proofErr w:type="spellStart"/>
-      <w:r>
-        <w:rPr>
-          <w:bCs/>
-        </w:rPr>
-        <w:t>ID_Sheet_Cible</w:t>
-      </w:r>
-      <w:proofErr w:type="spellEnd"/>
-      <w:r>
-        <w:rPr>
-          <w:bCs/>
-        </w:rPr>
-        <w:t xml:space="preserve">=...`  </w:t>
+        <w:t xml:space="preserve">     - Form `ID_Formulaire_Cible=...` • Sheet réponses `ID_Sheet_Cible=...`  </w:t>
       </w:r>
     </w:p>
     <w:p>
@@ -555,21 +359,7 @@
         <w:rPr>
           <w:bCs/>
         </w:rPr>
-        <w:t xml:space="preserve">   - Créations/</w:t>
-      </w:r>
-      <w:proofErr w:type="spellStart"/>
-      <w:r>
-        <w:rPr>
-          <w:bCs/>
-        </w:rPr>
-        <w:t>modifs</w:t>
-      </w:r>
-      <w:proofErr w:type="spellEnd"/>
-      <w:r>
-        <w:rPr>
-          <w:bCs/>
-        </w:rPr>
-        <w:t xml:space="preserve"> de fichiers, menus, triggers, paramètres (liste concise).</w:t>
+        <w:t xml:space="preserve">   - Créations/modifs de fichiers, menus, triggers, paramètres (liste concise).</w:t>
       </w:r>
     </w:p>
     <w:p>
@@ -621,21 +411,7 @@
         <w:rPr>
           <w:bCs/>
         </w:rPr>
-        <w:t xml:space="preserve">   - Menus visibles (Actions Usine, </w:t>
-      </w:r>
-      <w:proofErr w:type="spellStart"/>
-      <w:r>
-        <w:rPr>
-          <w:bCs/>
-        </w:rPr>
-        <w:t>RetraitementUI</w:t>
-      </w:r>
-      <w:proofErr w:type="spellEnd"/>
-      <w:r>
-        <w:rPr>
-          <w:bCs/>
-        </w:rPr>
-        <w:t xml:space="preserve">, Injecteur) </w:t>
+        <w:t xml:space="preserve">   - Menus visibles (Actions Usine, RetraitementUI, Injecteur) </w:t>
       </w:r>
       <w:r>
         <w:rPr>
@@ -804,21 +580,7 @@
         <w:rPr>
           <w:bCs/>
         </w:rPr>
-        <w:t xml:space="preserve">ration </w:t>
-      </w:r>
-      <w:proofErr w:type="spellStart"/>
-      <w:r>
-        <w:rPr>
-          <w:bCs/>
-        </w:rPr>
-        <w:t>Form</w:t>
-      </w:r>
-      <w:proofErr w:type="spellEnd"/>
-      <w:r>
-        <w:rPr>
-          <w:bCs/>
-        </w:rPr>
-        <w:t>, ECHELLE_NOTE, emailing, PDF, PJ, etc.</w:t>
+        <w:t>ration Form, ECHELLE_NOTE, emailing, PDF, PJ, etc.</w:t>
       </w:r>
     </w:p>
     <w:p>
@@ -870,48 +632,20 @@
         <w:rPr>
           <w:bCs/>
         </w:rPr>
-        <w:t>7. **</w:t>
+        <w:t>7. **Playbook de reprise (prochaines actions)**</w:t>
       </w:r>
-      <w:proofErr w:type="spellStart"/>
+    </w:p>
+    <w:p>
+      <w:pPr>
+        <w:rPr>
+          <w:bCs/>
+        </w:rPr>
+      </w:pPr>
       <w:r>
         <w:rPr>
           <w:bCs/>
         </w:rPr>
-        <w:t>Playbook</w:t>
-      </w:r>
-      <w:proofErr w:type="spellEnd"/>
-      <w:r>
-        <w:rPr>
-          <w:bCs/>
-        </w:rPr>
-        <w:t xml:space="preserve"> de reprise (prochaines actions)**</w:t>
-      </w:r>
-    </w:p>
-    <w:p>
-      <w:pPr>
-        <w:rPr>
-          <w:bCs/>
-        </w:rPr>
-      </w:pPr>
-      <w:r>
-        <w:rPr>
-          <w:bCs/>
-        </w:rPr>
-        <w:t xml:space="preserve">   - Étapes **ordonnées** et concrètes (où cliquer, quelle fonction exécuter, dans quel projet : Template vs </w:t>
-      </w:r>
-      <w:proofErr w:type="spellStart"/>
-      <w:r>
-        <w:rPr>
-          <w:bCs/>
-        </w:rPr>
-        <w:t>Sheet</w:t>
-      </w:r>
-      <w:proofErr w:type="spellEnd"/>
-      <w:r>
-        <w:rPr>
-          <w:bCs/>
-        </w:rPr>
-        <w:t xml:space="preserve"> de réponses).</w:t>
+        <w:t xml:space="preserve">   - Étapes **ordonnées** et concrètes (où cliquer, quelle fonction exécuter, dans quel projet : Template vs Sheet de réponses).</w:t>
       </w:r>
     </w:p>
     <w:p>
@@ -937,70 +671,20 @@
         <w:rPr>
           <w:bCs/>
         </w:rPr>
-        <w:t xml:space="preserve">   - Gabarits </w:t>
+        <w:t xml:space="preserve">   - Gabarits emails, `sys_Composition_Emails` (lignes clés N1/N2/N3), onglets BDD (Questions_, Profils_), fichiers Docs.</w:t>
       </w:r>
-      <w:proofErr w:type="gramStart"/>
+    </w:p>
+    <w:p>
+      <w:pPr>
+        <w:rPr>
+          <w:bCs/>
+        </w:rPr>
+      </w:pPr>
       <w:r>
         <w:rPr>
           <w:bCs/>
         </w:rPr>
-        <w:t>emails</w:t>
-      </w:r>
-      <w:proofErr w:type="gramEnd"/>
-      <w:r>
-        <w:rPr>
-          <w:bCs/>
-        </w:rPr>
-        <w:t>, `</w:t>
-      </w:r>
-      <w:proofErr w:type="spellStart"/>
-      <w:r>
-        <w:rPr>
-          <w:bCs/>
-        </w:rPr>
-        <w:t>sys_Composition_</w:t>
-      </w:r>
-      <w:proofErr w:type="gramStart"/>
-      <w:r>
-        <w:rPr>
-          <w:bCs/>
-        </w:rPr>
-        <w:t>Emails</w:t>
-      </w:r>
-      <w:proofErr w:type="spellEnd"/>
-      <w:proofErr w:type="gramEnd"/>
-      <w:r>
-        <w:rPr>
-          <w:bCs/>
-        </w:rPr>
-        <w:t>` (lignes clés N1/N2/N3), onglets BDD (Questions_, Profils_), fichiers Docs.</w:t>
-      </w:r>
-    </w:p>
-    <w:p>
-      <w:pPr>
-        <w:rPr>
-          <w:bCs/>
-        </w:rPr>
-      </w:pPr>
-      <w:r>
-        <w:rPr>
-          <w:bCs/>
-        </w:rPr>
-        <w:t>9. **</w:t>
-      </w:r>
-      <w:proofErr w:type="spellStart"/>
-      <w:r>
-        <w:rPr>
-          <w:bCs/>
-        </w:rPr>
-        <w:t>Snippets</w:t>
-      </w:r>
-      <w:proofErr w:type="spellEnd"/>
-      <w:r>
-        <w:rPr>
-          <w:bCs/>
-        </w:rPr>
-        <w:t xml:space="preserve"> prêts à l’emploi**</w:t>
+        <w:t>9. **Snippets prêts à l’emploi**</w:t>
       </w:r>
     </w:p>
     <w:p>
@@ -1065,21 +749,7 @@
         <w:rPr>
           <w:bCs/>
         </w:rPr>
-        <w:t xml:space="preserve">    - Étapes vers l’objectif final, dépendances, critères de “</w:t>
-      </w:r>
-      <w:proofErr w:type="spellStart"/>
-      <w:r>
-        <w:rPr>
-          <w:bCs/>
-        </w:rPr>
-        <w:t>done</w:t>
-      </w:r>
-      <w:proofErr w:type="spellEnd"/>
-      <w:r>
-        <w:rPr>
-          <w:bCs/>
-        </w:rPr>
-        <w:t>”.</w:t>
+        <w:t xml:space="preserve">    - Étapes vers l’objectif final, dépendances, critères de “done”.</w:t>
       </w:r>
     </w:p>
     <w:p>
@@ -1131,21 +801,7 @@
         <w:rPr>
           <w:bCs/>
         </w:rPr>
-        <w:t xml:space="preserve">    - Où sont les copies/</w:t>
-      </w:r>
-      <w:proofErr w:type="spellStart"/>
-      <w:r>
-        <w:rPr>
-          <w:bCs/>
-        </w:rPr>
-        <w:t>commits</w:t>
-      </w:r>
-      <w:proofErr w:type="spellEnd"/>
-      <w:r>
-        <w:rPr>
-          <w:bCs/>
-        </w:rPr>
-        <w:t>, comment revenir en arrière.</w:t>
+        <w:t xml:space="preserve">    - Où sont les copies/commits, comment revenir en arrière.</w:t>
       </w:r>
     </w:p>
     <w:p>
@@ -1172,49 +828,7 @@
           <w:bCs/>
         </w:rPr>
         <w:lastRenderedPageBreak/>
-        <w:t xml:space="preserve">    - Conventions de nommage (tests, feuilles, colonnes, IDs, profils), style des menus, formats JSON acceptés (ex: ECHELLE_NOTE: `min/max` ou `</w:t>
-      </w:r>
-      <w:proofErr w:type="spellStart"/>
-      <w:r>
-        <w:rPr>
-          <w:bCs/>
-        </w:rPr>
-        <w:t>echelle_min</w:t>
-      </w:r>
-      <w:proofErr w:type="spellEnd"/>
-      <w:r>
-        <w:rPr>
-          <w:bCs/>
-        </w:rPr>
-        <w:t>/</w:t>
-      </w:r>
-      <w:proofErr w:type="spellStart"/>
-      <w:r>
-        <w:rPr>
-          <w:bCs/>
-        </w:rPr>
-        <w:t>echelle_max</w:t>
-      </w:r>
-      <w:proofErr w:type="spellEnd"/>
-      <w:r>
-        <w:rPr>
-          <w:bCs/>
-        </w:rPr>
-        <w:t>`, labels `</w:t>
-      </w:r>
-      <w:proofErr w:type="spellStart"/>
-      <w:r>
-        <w:rPr>
-          <w:bCs/>
-        </w:rPr>
-        <w:t>label_min|libelle_min|labelMin</w:t>
-      </w:r>
-      <w:proofErr w:type="spellEnd"/>
-      <w:r>
-        <w:rPr>
-          <w:bCs/>
-        </w:rPr>
-        <w:t>`, etc.).</w:t>
+        <w:t xml:space="preserve">    - Conventions de nommage (tests, feuilles, colonnes, IDs, profils), style des menus, formats JSON acceptés (ex: ECHELLE_NOTE: `min/max` ou `echelle_min/echelle_max`, labels `label_min|libelle_min|labelMin`, etc.).</w:t>
       </w:r>
     </w:p>
     <w:p>
@@ -1345,104 +959,20 @@
         <w:rPr>
           <w:bCs/>
         </w:rPr>
-        <w:t xml:space="preserve">    - **But** : suivre toutes les variables/constantes utilisées dans les scripts (Apps Script, JSON d’onglets, </w:t>
+        <w:t xml:space="preserve">    - **But** : suivre toutes les variables/constantes utilisées dans les scripts (Apps Script, JSON d’onglets, placeholders d’emails).</w:t>
       </w:r>
-      <w:proofErr w:type="spellStart"/>
+    </w:p>
+    <w:p>
+      <w:pPr>
+        <w:rPr>
+          <w:bCs/>
+        </w:rPr>
+      </w:pPr>
       <w:r>
         <w:rPr>
           <w:bCs/>
         </w:rPr>
-        <w:t>placeholders</w:t>
-      </w:r>
-      <w:proofErr w:type="spellEnd"/>
-      <w:r>
-        <w:rPr>
-          <w:bCs/>
-        </w:rPr>
-        <w:t xml:space="preserve"> </w:t>
-      </w:r>
-      <w:proofErr w:type="gramStart"/>
-      <w:r>
-        <w:rPr>
-          <w:bCs/>
-        </w:rPr>
-        <w:t>d’emails</w:t>
-      </w:r>
-      <w:proofErr w:type="gramEnd"/>
-      <w:r>
-        <w:rPr>
-          <w:bCs/>
-        </w:rPr>
-        <w:t>).</w:t>
-      </w:r>
-    </w:p>
-    <w:p>
-      <w:pPr>
-        <w:rPr>
-          <w:bCs/>
-        </w:rPr>
-      </w:pPr>
-      <w:r>
-        <w:rPr>
-          <w:bCs/>
-        </w:rPr>
-        <w:t xml:space="preserve">    - **Inclus** : variables globales, constantes (ex: `ID_FEUILLE_CONFIGURATION`), clés de configuration (ex: `</w:t>
-      </w:r>
-      <w:proofErr w:type="spellStart"/>
-      <w:r>
-        <w:rPr>
-          <w:bCs/>
-        </w:rPr>
-        <w:t>ID_Gabarit_</w:t>
-      </w:r>
-      <w:proofErr w:type="gramStart"/>
-      <w:r>
-        <w:rPr>
-          <w:bCs/>
-        </w:rPr>
-        <w:t>Email</w:t>
-      </w:r>
-      <w:proofErr w:type="gramEnd"/>
-      <w:r>
-        <w:rPr>
-          <w:bCs/>
-        </w:rPr>
-        <w:t>_Repondant</w:t>
-      </w:r>
-      <w:proofErr w:type="spellEnd"/>
-      <w:r>
-        <w:rPr>
-          <w:bCs/>
-        </w:rPr>
-        <w:t xml:space="preserve">`), </w:t>
-      </w:r>
-      <w:proofErr w:type="spellStart"/>
-      <w:r>
-        <w:rPr>
-          <w:bCs/>
-        </w:rPr>
-        <w:t>placeholders</w:t>
-      </w:r>
-      <w:proofErr w:type="spellEnd"/>
-      <w:r>
-        <w:rPr>
-          <w:bCs/>
-        </w:rPr>
-        <w:t xml:space="preserve"> (ex: `{{</w:t>
-      </w:r>
-      <w:proofErr w:type="spellStart"/>
-      <w:r>
-        <w:rPr>
-          <w:bCs/>
-        </w:rPr>
-        <w:t>Titre_Profil</w:t>
-      </w:r>
-      <w:proofErr w:type="spellEnd"/>
-      <w:r>
-        <w:rPr>
-          <w:bCs/>
-        </w:rPr>
-        <w:t>}}`), noms d’onglets &amp; colonnes, structures JSON (clés `mode`, `profil`, `min`, etc.), et variables dérivées (ex: `ENV_STABILITE`, `ENV_VITESSE`).</w:t>
+        <w:t xml:space="preserve">    - **Inclus** : variables globales, constantes (ex: `ID_FEUILLE_CONFIGURATION`), clés de configuration (ex: `ID_Gabarit_Email_Repondant`), placeholders (ex: `{{Titre_Profil}}`), noms d’onglets &amp; colonnes, structures JSON (clés `mode`, `profil`, `min`, etc.), et variables dérivées (ex: `ENV_STABILITE`, `ENV_VITESSE`).</w:t>
       </w:r>
     </w:p>
     <w:p>
@@ -1468,63 +998,7 @@
         <w:rPr>
           <w:bCs/>
         </w:rPr>
-        <w:t xml:space="preserve">      | Nom | Type (</w:t>
-      </w:r>
-      <w:proofErr w:type="spellStart"/>
-      <w:r>
-        <w:rPr>
-          <w:bCs/>
-        </w:rPr>
-        <w:t>const</w:t>
-      </w:r>
-      <w:proofErr w:type="spellEnd"/>
-      <w:r>
-        <w:rPr>
-          <w:bCs/>
-        </w:rPr>
-        <w:t>/var/</w:t>
-      </w:r>
-      <w:proofErr w:type="spellStart"/>
-      <w:r>
-        <w:rPr>
-          <w:bCs/>
-        </w:rPr>
-        <w:t>placeholder</w:t>
-      </w:r>
-      <w:proofErr w:type="spellEnd"/>
-      <w:r>
-        <w:rPr>
-          <w:bCs/>
-        </w:rPr>
-        <w:t>/colonne/clé JSON) | Portée (Template/Moteur/</w:t>
-      </w:r>
-      <w:proofErr w:type="spellStart"/>
-      <w:r>
-        <w:rPr>
-          <w:bCs/>
-        </w:rPr>
-        <w:t>Sheet</w:t>
-      </w:r>
-      <w:proofErr w:type="spellEnd"/>
-      <w:r>
-        <w:rPr>
-          <w:bCs/>
-        </w:rPr>
-        <w:t xml:space="preserve"> </w:t>
-      </w:r>
-      <w:proofErr w:type="spellStart"/>
-      <w:r>
-        <w:rPr>
-          <w:bCs/>
-        </w:rPr>
-        <w:t>Rép</w:t>
-      </w:r>
-      <w:proofErr w:type="spellEnd"/>
-      <w:r>
-        <w:rPr>
-          <w:bCs/>
-        </w:rPr>
-        <w:t>/BDD/Email) | Fichier(s)/Onglet(s) | Usage/Finalité | Valeur par défaut / Format attendu | Exemple | Dépendances / Liens (IDs/Autres vars) | Historique (date → changement) |</w:t>
+        <w:t xml:space="preserve">      | Nom | Type (const/var/placeholder/colonne/clé JSON) | Portée (Template/Moteur/Sheet Rép/BDD/Email) | Fichier(s)/Onglet(s) | Usage/Finalité | Valeur par défaut / Format attendu | Exemple | Dépendances / Liens (IDs/Autres vars) | Historique (date → changement) |</w:t>
       </w:r>
     </w:p>
     <w:p>
@@ -1563,21 +1037,7 @@
         <w:rPr>
           <w:bCs/>
         </w:rPr>
-        <w:t xml:space="preserve">      - **Ajouter** toute nouvelle variable rencontrée dans la session (à partir des extraits de code, noms d’onglets/colonnes, JSON, </w:t>
-      </w:r>
-      <w:proofErr w:type="spellStart"/>
-      <w:r>
-        <w:rPr>
-          <w:bCs/>
-        </w:rPr>
-        <w:t>placeholders</w:t>
-      </w:r>
-      <w:proofErr w:type="spellEnd"/>
-      <w:r>
-        <w:rPr>
-          <w:bCs/>
-        </w:rPr>
-        <w:t>).</w:t>
+        <w:t xml:space="preserve">      - **Ajouter** toute nouvelle variable rencontrée dans la session (à partir des extraits de code, noms d’onglets/colonnes, JSON, placeholders).</w:t>
       </w:r>
     </w:p>
     <w:p>
@@ -1630,99 +1090,7 @@
           <w:bCs/>
         </w:rPr>
         <w:lastRenderedPageBreak/>
-        <w:t xml:space="preserve">      - Pour </w:t>
-      </w:r>
-      <w:proofErr w:type="spellStart"/>
-      <w:r>
-        <w:rPr>
-          <w:bCs/>
-        </w:rPr>
-        <w:t>placeholders</w:t>
-      </w:r>
-      <w:proofErr w:type="spellEnd"/>
-      <w:r>
-        <w:rPr>
-          <w:bCs/>
-        </w:rPr>
-        <w:t xml:space="preserve"> </w:t>
-      </w:r>
-      <w:proofErr w:type="gramStart"/>
-      <w:r>
-        <w:rPr>
-          <w:bCs/>
-        </w:rPr>
-        <w:t>d’e-mail</w:t>
-      </w:r>
-      <w:proofErr w:type="gramEnd"/>
-      <w:r>
-        <w:rPr>
-          <w:bCs/>
-        </w:rPr>
-        <w:t xml:space="preserve"> `{{...}}`, noter la **source** (gabarit Doc/`</w:t>
-      </w:r>
-      <w:proofErr w:type="spellStart"/>
-      <w:r>
-        <w:rPr>
-          <w:bCs/>
-        </w:rPr>
-        <w:t>sys_Composition_</w:t>
-      </w:r>
-      <w:proofErr w:type="gramStart"/>
-      <w:r>
-        <w:rPr>
-          <w:bCs/>
-        </w:rPr>
-        <w:t>Emails</w:t>
-      </w:r>
-      <w:proofErr w:type="spellEnd"/>
-      <w:proofErr w:type="gramEnd"/>
-      <w:r>
-        <w:rPr>
-          <w:bCs/>
-        </w:rPr>
-        <w:t xml:space="preserve">`) et </w:t>
-      </w:r>
-      <w:proofErr w:type="gramStart"/>
-      <w:r>
-        <w:rPr>
-          <w:bCs/>
-        </w:rPr>
-        <w:t>la</w:t>
-      </w:r>
-      <w:proofErr w:type="gramEnd"/>
-      <w:r>
-        <w:rPr>
-          <w:bCs/>
-        </w:rPr>
-        <w:t xml:space="preserve"> **valeur de substitution** (ex: clé dans `</w:t>
-      </w:r>
-      <w:proofErr w:type="spellStart"/>
-      <w:r>
-        <w:rPr>
-          <w:bCs/>
-        </w:rPr>
-        <w:t>reponse</w:t>
-      </w:r>
-      <w:proofErr w:type="spellEnd"/>
-      <w:r>
-        <w:rPr>
-          <w:bCs/>
-        </w:rPr>
-        <w:t>`/`</w:t>
-      </w:r>
-      <w:proofErr w:type="spellStart"/>
-      <w:r>
-        <w:rPr>
-          <w:bCs/>
-        </w:rPr>
-        <w:t>resultats</w:t>
-      </w:r>
-      <w:proofErr w:type="spellEnd"/>
-      <w:r>
-        <w:rPr>
-          <w:bCs/>
-        </w:rPr>
-        <w:t>`).</w:t>
+        <w:t xml:space="preserve">      - Pour placeholders d’e-mail `{{...}}`, noter la **source** (gabarit Doc/`sys_Composition_Emails`) et la **valeur de substitution** (ex: clé dans `reponse`/`resultats`).</w:t>
       </w:r>
     </w:p>
     <w:p>
@@ -1794,21 +1162,7 @@
         <w:rPr>
           <w:bCs/>
         </w:rPr>
-        <w:t xml:space="preserve">- **Ne pas inclure ce prompt** dans la sortie. La sortie attendue est **UNIQUEMENT** le document </w:t>
-      </w:r>
-      <w:proofErr w:type="spellStart"/>
-      <w:r>
-        <w:rPr>
-          <w:bCs/>
-        </w:rPr>
-        <w:t>Markdown</w:t>
-      </w:r>
-      <w:proofErr w:type="spellEnd"/>
-      <w:r>
-        <w:rPr>
-          <w:bCs/>
-        </w:rPr>
-        <w:t xml:space="preserve"> final.</w:t>
+        <w:t>- **Ne pas inclure ce prompt** dans la sortie. La sortie attendue est **UNIQUEMENT** le document Markdown final.</w:t>
       </w:r>
     </w:p>
     <w:p>
@@ -1841,21 +1195,27 @@
         <w:rPr>
           <w:bCs/>
         </w:rPr>
-        <w:t xml:space="preserve">→ Un **unique document </w:t>
+        <w:t>→ Un **unique document Markdown** respectant strictement le plan et les règles ci-dessus, avec **Annexe A (Glossaire)** et **Annexe B (Registre des variables)** **fusionnées/enrichies** à partir du dernier document si fourni.</w:t>
       </w:r>
-      <w:proofErr w:type="spellStart"/>
+    </w:p>
+    <w:p>
+      <w:pPr>
+        <w:rPr>
+          <w:bCs/>
+        </w:rPr>
+      </w:pPr>
+    </w:p>
+    <w:p>
+      <w:pPr>
+        <w:rPr>
+          <w:bCs/>
+        </w:rPr>
+      </w:pPr>
       <w:r>
         <w:rPr>
           <w:bCs/>
         </w:rPr>
-        <w:t>Markdown</w:t>
-      </w:r>
-      <w:proofErr w:type="spellEnd"/>
-      <w:r>
-        <w:rPr>
-          <w:bCs/>
-        </w:rPr>
-        <w:t>** respectant strictement le plan et les règles ci-dessus, avec **Annexe A (Glossaire)** et **Annexe B (Registre des variables)** **fusionnées/enrichies** à partir du dernier document si fourni.</w:t>
+        <w:t>À la fin de chaque document, tu devras également tenir une check-list les travaux/modification à réaliser que je te dicterais comme choses à mémoriser lors de nos sessions. L’idée est que nous nous perdions pas une information qui nous viendrait à l’esprit lors d’une session, certes on peut le reporter sur le document d’état du projet, mais si on ne traite pas durant la session suivante, il faut en garder la mémoire. C’est pour cela que je te demanderai de garder la mémoire de tout ce qu’il y a à faire que je t’aurais demandé, devra voter si je te demande de mémoriser lors d’une session un nouveau travail à faire, et de n’enlever que ce que nous aurons effectivement réalisé comme modification. Le rendu est donc une liste enfin du document état de projet de choses à faire dans le futur</w:t>
       </w:r>
     </w:p>
     <w:sectPr>

</xml_diff>

<commit_message>
Backup auto 2025-09-18 05:08:59
</commit_message>
<xml_diff>
--- a/ZZ échange avec Chatgpt/00000 prompt pour  Doc État du Projet.docx
+++ b/ZZ échange avec Chatgpt/00000 prompt pour  Doc État du Projet.docx
@@ -12,7 +12,27 @@
         <w:rPr>
           <w:bCs/>
         </w:rPr>
-        <w:t>Tu es mon secrétaire technique. Génère un **document Markdown unique** de synthèse de session pour le projet ci-dessous. N’ajoute aucune question. Si une information manque, **déduis prudemment** et note `{{à compléter}}`. Le document doit être **actionnable**, **sans digression**, et contenir des **annexes persistantes** (Glossaire + Registre des variables) à **fusionner** depuis la version précédente si elle est fournie.</w:t>
+        <w:t xml:space="preserve"> </w:t>
+      </w:r>
+      <w:r>
+        <w:rPr>
+          <w:bCs/>
+        </w:rPr>
+        <w:t xml:space="preserve">Tu es mon secrétaire technique. Génère un **document </w:t>
+      </w:r>
+      <w:proofErr w:type="spellStart"/>
+      <w:r>
+        <w:rPr>
+          <w:bCs/>
+        </w:rPr>
+        <w:t>Markdown</w:t>
+      </w:r>
+      <w:proofErr w:type="spellEnd"/>
+      <w:r>
+        <w:rPr>
+          <w:bCs/>
+        </w:rPr>
+        <w:t xml:space="preserve"> unique** de synthèse de session pour le projet ci-dessous. N’ajoute aucune question. Si une information manque, **déduis prudemment** et note `{{à compléter}}`. Le document doit être **actionnable**, **sans digression**, et contenir des **annexes persistantes** (Glossaire + Registre des variables) à **fusionner** depuis la version précédente si elle est fournie.</w:t>
       </w:r>
     </w:p>
     <w:p>
@@ -45,7 +65,35 @@
         <w:rPr>
           <w:bCs/>
         </w:rPr>
-        <w:t>- Projet : {{nom_du_projet}} (ex: r&amp;K_Environnement)</w:t>
+        <w:t>- Projet : {{</w:t>
+      </w:r>
+      <w:proofErr w:type="spellStart"/>
+      <w:r>
+        <w:rPr>
+          <w:bCs/>
+        </w:rPr>
+        <w:t>nom_du_projet</w:t>
+      </w:r>
+      <w:proofErr w:type="spellEnd"/>
+      <w:r>
+        <w:rPr>
+          <w:bCs/>
+        </w:rPr>
+        <w:t xml:space="preserve">}} (ex: </w:t>
+      </w:r>
+      <w:proofErr w:type="spellStart"/>
+      <w:r>
+        <w:rPr>
+          <w:bCs/>
+        </w:rPr>
+        <w:t>r&amp;K_Environnement</w:t>
+      </w:r>
+      <w:proofErr w:type="spellEnd"/>
+      <w:r>
+        <w:rPr>
+          <w:bCs/>
+        </w:rPr>
+        <w:t>)</w:t>
       </w:r>
     </w:p>
     <w:p>
@@ -58,7 +106,21 @@
         <w:rPr>
           <w:bCs/>
         </w:rPr>
-        <w:t>- Session : {{YYYY-MM-DD}} — {{tag_session}} (ex: 2025-08-24 — S08)</w:t>
+        <w:t>- Session : {{YYYY-MM-DD}} — {{</w:t>
+      </w:r>
+      <w:proofErr w:type="spellStart"/>
+      <w:r>
+        <w:rPr>
+          <w:bCs/>
+        </w:rPr>
+        <w:t>tag_session</w:t>
+      </w:r>
+      <w:proofErr w:type="spellEnd"/>
+      <w:r>
+        <w:rPr>
+          <w:bCs/>
+        </w:rPr>
+        <w:t>}} (ex: 2025-08-24 — S08)</w:t>
       </w:r>
     </w:p>
     <w:p>
@@ -71,7 +133,21 @@
         <w:rPr>
           <w:bCs/>
         </w:rPr>
-        <w:t>- Objectif global : {{objectif_global}}</w:t>
+        <w:t>- Objectif global : {{</w:t>
+      </w:r>
+      <w:proofErr w:type="spellStart"/>
+      <w:r>
+        <w:rPr>
+          <w:bCs/>
+        </w:rPr>
+        <w:t>objectif_global</w:t>
+      </w:r>
+      <w:proofErr w:type="spellEnd"/>
+      <w:r>
+        <w:rPr>
+          <w:bCs/>
+        </w:rPr>
+        <w:t>}}</w:t>
       </w:r>
     </w:p>
     <w:p>
@@ -84,7 +160,21 @@
         <w:rPr>
           <w:bCs/>
         </w:rPr>
-        <w:t>- Focus de la session : {{focus_du_jour}}</w:t>
+        <w:t>- Focus de la session : {{</w:t>
+      </w:r>
+      <w:proofErr w:type="spellStart"/>
+      <w:r>
+        <w:rPr>
+          <w:bCs/>
+        </w:rPr>
+        <w:t>focus_du_jour</w:t>
+      </w:r>
+      <w:proofErr w:type="spellEnd"/>
+      <w:r>
+        <w:rPr>
+          <w:bCs/>
+        </w:rPr>
+        <w:t>}}</w:t>
       </w:r>
     </w:p>
     <w:p>
@@ -97,7 +187,21 @@
         <w:rPr>
           <w:bCs/>
         </w:rPr>
-        <w:t>- Ligne CONFIG cible (si connue) : {{rowIndex}}</w:t>
+        <w:t>- Ligne CONFIG cible (si connue) : {{</w:t>
+      </w:r>
+      <w:proofErr w:type="spellStart"/>
+      <w:r>
+        <w:rPr>
+          <w:bCs/>
+        </w:rPr>
+        <w:t>rowIndex</w:t>
+      </w:r>
+      <w:proofErr w:type="spellEnd"/>
+      <w:r>
+        <w:rPr>
+          <w:bCs/>
+        </w:rPr>
+        <w:t>}}</w:t>
       </w:r>
     </w:p>
     <w:p>
@@ -123,7 +227,21 @@
         <w:rPr>
           <w:bCs/>
         </w:rPr>
-        <w:t>- Contexte précédent : Je te fournis le *dernier Markdown* à jour **si disponible**. Tu dois y puiser et **fusionner** Glossaire &amp; Registre des variables (voir règles de persistance).</w:t>
+        <w:t xml:space="preserve">- Contexte précédent : Je te fournis le *dernier </w:t>
+      </w:r>
+      <w:proofErr w:type="spellStart"/>
+      <w:r>
+        <w:rPr>
+          <w:bCs/>
+        </w:rPr>
+        <w:t>Markdown</w:t>
+      </w:r>
+      <w:proofErr w:type="spellEnd"/>
+      <w:r>
+        <w:rPr>
+          <w:bCs/>
+        </w:rPr>
+        <w:t>* à jour **si disponible**. Tu dois y puiser et **fusionner** Glossaire &amp; Registre des variables (voir règles de persistance).</w:t>
       </w:r>
     </w:p>
     <w:p>
@@ -156,7 +274,35 @@
         <w:rPr>
           <w:bCs/>
         </w:rPr>
-        <w:t>- **Un seul fichier Markdown**, structuré, clair, actionnable. Pas de texte hors Markdown. Pas de questions.</w:t>
+        <w:t xml:space="preserve">- **Un seul fichier </w:t>
+      </w:r>
+      <w:proofErr w:type="spellStart"/>
+      <w:r>
+        <w:rPr>
+          <w:bCs/>
+        </w:rPr>
+        <w:t>Markdown</w:t>
+      </w:r>
+      <w:proofErr w:type="spellEnd"/>
+      <w:r>
+        <w:rPr>
+          <w:bCs/>
+        </w:rPr>
+        <w:t xml:space="preserve">**, structuré, clair, actionnable. Pas de texte hors </w:t>
+      </w:r>
+      <w:proofErr w:type="spellStart"/>
+      <w:r>
+        <w:rPr>
+          <w:bCs/>
+        </w:rPr>
+        <w:t>Markdown</w:t>
+      </w:r>
+      <w:proofErr w:type="spellEnd"/>
+      <w:r>
+        <w:rPr>
+          <w:bCs/>
+        </w:rPr>
+        <w:t>. Pas de questions.</w:t>
       </w:r>
     </w:p>
     <w:p>
@@ -306,7 +452,63 @@
         <w:rPr>
           <w:bCs/>
         </w:rPr>
-        <w:t xml:space="preserve">     - Form `ID_Formulaire_Cible=...` • Sheet réponses `ID_Sheet_Cible=...`  </w:t>
+        <w:t xml:space="preserve">     - </w:t>
+      </w:r>
+      <w:proofErr w:type="spellStart"/>
+      <w:r>
+        <w:rPr>
+          <w:bCs/>
+        </w:rPr>
+        <w:t>Form</w:t>
+      </w:r>
+      <w:proofErr w:type="spellEnd"/>
+      <w:r>
+        <w:rPr>
+          <w:bCs/>
+        </w:rPr>
+        <w:t xml:space="preserve"> `</w:t>
+      </w:r>
+      <w:proofErr w:type="spellStart"/>
+      <w:r>
+        <w:rPr>
+          <w:bCs/>
+        </w:rPr>
+        <w:t>ID_Formulaire_Cible</w:t>
+      </w:r>
+      <w:proofErr w:type="spellEnd"/>
+      <w:r>
+        <w:rPr>
+          <w:bCs/>
+        </w:rPr>
+        <w:t xml:space="preserve">=...` • </w:t>
+      </w:r>
+      <w:proofErr w:type="spellStart"/>
+      <w:r>
+        <w:rPr>
+          <w:bCs/>
+        </w:rPr>
+        <w:t>Sheet</w:t>
+      </w:r>
+      <w:proofErr w:type="spellEnd"/>
+      <w:r>
+        <w:rPr>
+          <w:bCs/>
+        </w:rPr>
+        <w:t xml:space="preserve"> réponses `</w:t>
+      </w:r>
+      <w:proofErr w:type="spellStart"/>
+      <w:r>
+        <w:rPr>
+          <w:bCs/>
+        </w:rPr>
+        <w:t>ID_Sheet_Cible</w:t>
+      </w:r>
+      <w:proofErr w:type="spellEnd"/>
+      <w:r>
+        <w:rPr>
+          <w:bCs/>
+        </w:rPr>
+        <w:t xml:space="preserve">=...`  </w:t>
       </w:r>
     </w:p>
     <w:p>
@@ -359,7 +561,21 @@
         <w:rPr>
           <w:bCs/>
         </w:rPr>
-        <w:t xml:space="preserve">   - Créations/modifs de fichiers, menus, triggers, paramètres (liste concise).</w:t>
+        <w:t xml:space="preserve">   - Créations/</w:t>
+      </w:r>
+      <w:proofErr w:type="spellStart"/>
+      <w:r>
+        <w:rPr>
+          <w:bCs/>
+        </w:rPr>
+        <w:t>modifs</w:t>
+      </w:r>
+      <w:proofErr w:type="spellEnd"/>
+      <w:r>
+        <w:rPr>
+          <w:bCs/>
+        </w:rPr>
+        <w:t xml:space="preserve"> de fichiers, menus, triggers, paramètres (liste concise).</w:t>
       </w:r>
     </w:p>
     <w:p>
@@ -411,7 +627,21 @@
         <w:rPr>
           <w:bCs/>
         </w:rPr>
-        <w:t xml:space="preserve">   - Menus visibles (Actions Usine, RetraitementUI, Injecteur) </w:t>
+        <w:t xml:space="preserve">   - Menus visibles (Actions Usine, </w:t>
+      </w:r>
+      <w:proofErr w:type="spellStart"/>
+      <w:r>
+        <w:rPr>
+          <w:bCs/>
+        </w:rPr>
+        <w:t>RetraitementUI</w:t>
+      </w:r>
+      <w:proofErr w:type="spellEnd"/>
+      <w:r>
+        <w:rPr>
+          <w:bCs/>
+        </w:rPr>
+        <w:t xml:space="preserve">, Injecteur) </w:t>
       </w:r>
       <w:r>
         <w:rPr>
@@ -580,7 +810,21 @@
         <w:rPr>
           <w:bCs/>
         </w:rPr>
-        <w:t>ration Form, ECHELLE_NOTE, emailing, PDF, PJ, etc.</w:t>
+        <w:t xml:space="preserve">ration </w:t>
+      </w:r>
+      <w:proofErr w:type="spellStart"/>
+      <w:r>
+        <w:rPr>
+          <w:bCs/>
+        </w:rPr>
+        <w:t>Form</w:t>
+      </w:r>
+      <w:proofErr w:type="spellEnd"/>
+      <w:r>
+        <w:rPr>
+          <w:bCs/>
+        </w:rPr>
+        <w:t>, ECHELLE_NOTE, emailing, PDF, PJ, etc.</w:t>
       </w:r>
     </w:p>
     <w:p>
@@ -632,7 +876,21 @@
         <w:rPr>
           <w:bCs/>
         </w:rPr>
-        <w:t>7. **Playbook de reprise (prochaines actions)**</w:t>
+        <w:t>7. **</w:t>
+      </w:r>
+      <w:proofErr w:type="spellStart"/>
+      <w:r>
+        <w:rPr>
+          <w:bCs/>
+        </w:rPr>
+        <w:t>Playbook</w:t>
+      </w:r>
+      <w:proofErr w:type="spellEnd"/>
+      <w:r>
+        <w:rPr>
+          <w:bCs/>
+        </w:rPr>
+        <w:t xml:space="preserve"> de reprise (prochaines actions)**</w:t>
       </w:r>
     </w:p>
     <w:p>
@@ -645,7 +903,21 @@
         <w:rPr>
           <w:bCs/>
         </w:rPr>
-        <w:t xml:space="preserve">   - Étapes **ordonnées** et concrètes (où cliquer, quelle fonction exécuter, dans quel projet : Template vs Sheet de réponses).</w:t>
+        <w:t xml:space="preserve">   - Étapes **ordonnées** et concrètes (où cliquer, quelle fonction exécuter, dans quel projet : Template vs </w:t>
+      </w:r>
+      <w:proofErr w:type="spellStart"/>
+      <w:r>
+        <w:rPr>
+          <w:bCs/>
+        </w:rPr>
+        <w:t>Sheet</w:t>
+      </w:r>
+      <w:proofErr w:type="spellEnd"/>
+      <w:r>
+        <w:rPr>
+          <w:bCs/>
+        </w:rPr>
+        <w:t xml:space="preserve"> de réponses).</w:t>
       </w:r>
     </w:p>
     <w:p>
@@ -671,7 +943,43 @@
         <w:rPr>
           <w:bCs/>
         </w:rPr>
-        <w:t xml:space="preserve">   - Gabarits emails, `sys_Composition_Emails` (lignes clés N1/N2/N3), onglets BDD (Questions_, Profils_), fichiers Docs.</w:t>
+        <w:t xml:space="preserve">   - Gabarits </w:t>
+      </w:r>
+      <w:proofErr w:type="gramStart"/>
+      <w:r>
+        <w:rPr>
+          <w:bCs/>
+        </w:rPr>
+        <w:t>emails</w:t>
+      </w:r>
+      <w:proofErr w:type="gramEnd"/>
+      <w:r>
+        <w:rPr>
+          <w:bCs/>
+        </w:rPr>
+        <w:t>, `</w:t>
+      </w:r>
+      <w:proofErr w:type="spellStart"/>
+      <w:r>
+        <w:rPr>
+          <w:bCs/>
+        </w:rPr>
+        <w:t>sys_Composition_</w:t>
+      </w:r>
+      <w:proofErr w:type="gramStart"/>
+      <w:r>
+        <w:rPr>
+          <w:bCs/>
+        </w:rPr>
+        <w:t>Emails</w:t>
+      </w:r>
+      <w:proofErr w:type="spellEnd"/>
+      <w:proofErr w:type="gramEnd"/>
+      <w:r>
+        <w:rPr>
+          <w:bCs/>
+        </w:rPr>
+        <w:t>` (lignes clés N1/N2/N3), onglets BDD (Questions_, Profils_), fichiers Docs.</w:t>
       </w:r>
     </w:p>
     <w:p>
@@ -684,7 +992,21 @@
         <w:rPr>
           <w:bCs/>
         </w:rPr>
-        <w:t>9. **Snippets prêts à l’emploi**</w:t>
+        <w:t>9. **</w:t>
+      </w:r>
+      <w:proofErr w:type="spellStart"/>
+      <w:r>
+        <w:rPr>
+          <w:bCs/>
+        </w:rPr>
+        <w:t>Snippets</w:t>
+      </w:r>
+      <w:proofErr w:type="spellEnd"/>
+      <w:r>
+        <w:rPr>
+          <w:bCs/>
+        </w:rPr>
+        <w:t xml:space="preserve"> prêts à l’emploi**</w:t>
       </w:r>
     </w:p>
     <w:p>
@@ -749,7 +1071,21 @@
         <w:rPr>
           <w:bCs/>
         </w:rPr>
-        <w:t xml:space="preserve">    - Étapes vers l’objectif final, dépendances, critères de “done”.</w:t>
+        <w:t xml:space="preserve">    - Étapes vers l’objectif final, dépendances, critères de “</w:t>
+      </w:r>
+      <w:proofErr w:type="spellStart"/>
+      <w:r>
+        <w:rPr>
+          <w:bCs/>
+        </w:rPr>
+        <w:t>done</w:t>
+      </w:r>
+      <w:proofErr w:type="spellEnd"/>
+      <w:r>
+        <w:rPr>
+          <w:bCs/>
+        </w:rPr>
+        <w:t>”.</w:t>
       </w:r>
     </w:p>
     <w:p>
@@ -801,7 +1137,21 @@
         <w:rPr>
           <w:bCs/>
         </w:rPr>
-        <w:t xml:space="preserve">    - Où sont les copies/commits, comment revenir en arrière.</w:t>
+        <w:t xml:space="preserve">    - Où sont les copies/</w:t>
+      </w:r>
+      <w:proofErr w:type="spellStart"/>
+      <w:r>
+        <w:rPr>
+          <w:bCs/>
+        </w:rPr>
+        <w:t>commits</w:t>
+      </w:r>
+      <w:proofErr w:type="spellEnd"/>
+      <w:r>
+        <w:rPr>
+          <w:bCs/>
+        </w:rPr>
+        <w:t>, comment revenir en arrière.</w:t>
       </w:r>
     </w:p>
     <w:p>
@@ -828,7 +1178,49 @@
           <w:bCs/>
         </w:rPr>
         <w:lastRenderedPageBreak/>
-        <w:t xml:space="preserve">    - Conventions de nommage (tests, feuilles, colonnes, IDs, profils), style des menus, formats JSON acceptés (ex: ECHELLE_NOTE: `min/max` ou `echelle_min/echelle_max`, labels `label_min|libelle_min|labelMin`, etc.).</w:t>
+        <w:t xml:space="preserve">    - Conventions de nommage (tests, feuilles, colonnes, IDs, profils), style des menus, formats JSON acceptés (ex: ECHELLE_NOTE: `min/max` ou `</w:t>
+      </w:r>
+      <w:proofErr w:type="spellStart"/>
+      <w:r>
+        <w:rPr>
+          <w:bCs/>
+        </w:rPr>
+        <w:t>echelle_min</w:t>
+      </w:r>
+      <w:proofErr w:type="spellEnd"/>
+      <w:r>
+        <w:rPr>
+          <w:bCs/>
+        </w:rPr>
+        <w:t>/</w:t>
+      </w:r>
+      <w:proofErr w:type="spellStart"/>
+      <w:r>
+        <w:rPr>
+          <w:bCs/>
+        </w:rPr>
+        <w:t>echelle_max</w:t>
+      </w:r>
+      <w:proofErr w:type="spellEnd"/>
+      <w:r>
+        <w:rPr>
+          <w:bCs/>
+        </w:rPr>
+        <w:t>`, labels `</w:t>
+      </w:r>
+      <w:proofErr w:type="spellStart"/>
+      <w:r>
+        <w:rPr>
+          <w:bCs/>
+        </w:rPr>
+        <w:t>label_min|libelle_min|labelMin</w:t>
+      </w:r>
+      <w:proofErr w:type="spellEnd"/>
+      <w:r>
+        <w:rPr>
+          <w:bCs/>
+        </w:rPr>
+        <w:t>`, etc.).</w:t>
       </w:r>
     </w:p>
     <w:p>
@@ -959,7 +1351,35 @@
         <w:rPr>
           <w:bCs/>
         </w:rPr>
-        <w:t xml:space="preserve">    - **But** : suivre toutes les variables/constantes utilisées dans les scripts (Apps Script, JSON d’onglets, placeholders d’emails).</w:t>
+        <w:t xml:space="preserve">    - **But** : suivre toutes les variables/constantes utilisées dans les scripts (Apps Script, JSON d’onglets, </w:t>
+      </w:r>
+      <w:proofErr w:type="spellStart"/>
+      <w:r>
+        <w:rPr>
+          <w:bCs/>
+        </w:rPr>
+        <w:t>placeholders</w:t>
+      </w:r>
+      <w:proofErr w:type="spellEnd"/>
+      <w:r>
+        <w:rPr>
+          <w:bCs/>
+        </w:rPr>
+        <w:t xml:space="preserve"> </w:t>
+      </w:r>
+      <w:proofErr w:type="gramStart"/>
+      <w:r>
+        <w:rPr>
+          <w:bCs/>
+        </w:rPr>
+        <w:t>d’emails</w:t>
+      </w:r>
+      <w:proofErr w:type="gramEnd"/>
+      <w:r>
+        <w:rPr>
+          <w:bCs/>
+        </w:rPr>
+        <w:t>).</w:t>
       </w:r>
     </w:p>
     <w:p>
@@ -972,7 +1392,63 @@
         <w:rPr>
           <w:bCs/>
         </w:rPr>
-        <w:t xml:space="preserve">    - **Inclus** : variables globales, constantes (ex: `ID_FEUILLE_CONFIGURATION`), clés de configuration (ex: `ID_Gabarit_Email_Repondant`), placeholders (ex: `{{Titre_Profil}}`), noms d’onglets &amp; colonnes, structures JSON (clés `mode`, `profil`, `min`, etc.), et variables dérivées (ex: `ENV_STABILITE`, `ENV_VITESSE`).</w:t>
+        <w:t xml:space="preserve">    - **Inclus** : variables globales, constantes (ex: `ID_FEUILLE_CONFIGURATION`), clés de configuration (ex: `</w:t>
+      </w:r>
+      <w:proofErr w:type="spellStart"/>
+      <w:r>
+        <w:rPr>
+          <w:bCs/>
+        </w:rPr>
+        <w:t>ID_Gabarit_</w:t>
+      </w:r>
+      <w:proofErr w:type="gramStart"/>
+      <w:r>
+        <w:rPr>
+          <w:bCs/>
+        </w:rPr>
+        <w:t>Email</w:t>
+      </w:r>
+      <w:proofErr w:type="gramEnd"/>
+      <w:r>
+        <w:rPr>
+          <w:bCs/>
+        </w:rPr>
+        <w:t>_Repondant</w:t>
+      </w:r>
+      <w:proofErr w:type="spellEnd"/>
+      <w:r>
+        <w:rPr>
+          <w:bCs/>
+        </w:rPr>
+        <w:t xml:space="preserve">`), </w:t>
+      </w:r>
+      <w:proofErr w:type="spellStart"/>
+      <w:r>
+        <w:rPr>
+          <w:bCs/>
+        </w:rPr>
+        <w:t>placeholders</w:t>
+      </w:r>
+      <w:proofErr w:type="spellEnd"/>
+      <w:r>
+        <w:rPr>
+          <w:bCs/>
+        </w:rPr>
+        <w:t xml:space="preserve"> (ex: `{{</w:t>
+      </w:r>
+      <w:proofErr w:type="spellStart"/>
+      <w:r>
+        <w:rPr>
+          <w:bCs/>
+        </w:rPr>
+        <w:t>Titre_Profil</w:t>
+      </w:r>
+      <w:proofErr w:type="spellEnd"/>
+      <w:r>
+        <w:rPr>
+          <w:bCs/>
+        </w:rPr>
+        <w:t>}}`), noms d’onglets &amp; colonnes, structures JSON (clés `mode`, `profil`, `min`, etc.), et variables dérivées (ex: `ENV_STABILITE`, `ENV_VITESSE`).</w:t>
       </w:r>
     </w:p>
     <w:p>
@@ -998,7 +1474,63 @@
         <w:rPr>
           <w:bCs/>
         </w:rPr>
-        <w:t xml:space="preserve">      | Nom | Type (const/var/placeholder/colonne/clé JSON) | Portée (Template/Moteur/Sheet Rép/BDD/Email) | Fichier(s)/Onglet(s) | Usage/Finalité | Valeur par défaut / Format attendu | Exemple | Dépendances / Liens (IDs/Autres vars) | Historique (date → changement) |</w:t>
+        <w:t xml:space="preserve">      | Nom | Type (</w:t>
+      </w:r>
+      <w:proofErr w:type="spellStart"/>
+      <w:r>
+        <w:rPr>
+          <w:bCs/>
+        </w:rPr>
+        <w:t>const</w:t>
+      </w:r>
+      <w:proofErr w:type="spellEnd"/>
+      <w:r>
+        <w:rPr>
+          <w:bCs/>
+        </w:rPr>
+        <w:t>/var/</w:t>
+      </w:r>
+      <w:proofErr w:type="spellStart"/>
+      <w:r>
+        <w:rPr>
+          <w:bCs/>
+        </w:rPr>
+        <w:t>placeholder</w:t>
+      </w:r>
+      <w:proofErr w:type="spellEnd"/>
+      <w:r>
+        <w:rPr>
+          <w:bCs/>
+        </w:rPr>
+        <w:t>/colonne/clé JSON) | Portée (Template/Moteur/</w:t>
+      </w:r>
+      <w:proofErr w:type="spellStart"/>
+      <w:r>
+        <w:rPr>
+          <w:bCs/>
+        </w:rPr>
+        <w:t>Sheet</w:t>
+      </w:r>
+      <w:proofErr w:type="spellEnd"/>
+      <w:r>
+        <w:rPr>
+          <w:bCs/>
+        </w:rPr>
+        <w:t xml:space="preserve"> </w:t>
+      </w:r>
+      <w:proofErr w:type="spellStart"/>
+      <w:r>
+        <w:rPr>
+          <w:bCs/>
+        </w:rPr>
+        <w:t>Rép</w:t>
+      </w:r>
+      <w:proofErr w:type="spellEnd"/>
+      <w:r>
+        <w:rPr>
+          <w:bCs/>
+        </w:rPr>
+        <w:t>/BDD/Email) | Fichier(s)/Onglet(s) | Usage/Finalité | Valeur par défaut / Format attendu | Exemple | Dépendances / Liens (IDs/Autres vars) | Historique (date → changement) |</w:t>
       </w:r>
     </w:p>
     <w:p>
@@ -1037,7 +1569,21 @@
         <w:rPr>
           <w:bCs/>
         </w:rPr>
-        <w:t xml:space="preserve">      - **Ajouter** toute nouvelle variable rencontrée dans la session (à partir des extraits de code, noms d’onglets/colonnes, JSON, placeholders).</w:t>
+        <w:t xml:space="preserve">      - **Ajouter** toute nouvelle variable rencontrée dans la session (à partir des extraits de code, noms d’onglets/colonnes, JSON, </w:t>
+      </w:r>
+      <w:proofErr w:type="spellStart"/>
+      <w:r>
+        <w:rPr>
+          <w:bCs/>
+        </w:rPr>
+        <w:t>placeholders</w:t>
+      </w:r>
+      <w:proofErr w:type="spellEnd"/>
+      <w:r>
+        <w:rPr>
+          <w:bCs/>
+        </w:rPr>
+        <w:t>).</w:t>
       </w:r>
     </w:p>
     <w:p>
@@ -1090,7 +1636,99 @@
           <w:bCs/>
         </w:rPr>
         <w:lastRenderedPageBreak/>
-        <w:t xml:space="preserve">      - Pour placeholders d’e-mail `{{...}}`, noter la **source** (gabarit Doc/`sys_Composition_Emails`) et la **valeur de substitution** (ex: clé dans `reponse`/`resultats`).</w:t>
+        <w:t xml:space="preserve">      - Pour </w:t>
+      </w:r>
+      <w:proofErr w:type="spellStart"/>
+      <w:r>
+        <w:rPr>
+          <w:bCs/>
+        </w:rPr>
+        <w:t>placeholders</w:t>
+      </w:r>
+      <w:proofErr w:type="spellEnd"/>
+      <w:r>
+        <w:rPr>
+          <w:bCs/>
+        </w:rPr>
+        <w:t xml:space="preserve"> </w:t>
+      </w:r>
+      <w:proofErr w:type="gramStart"/>
+      <w:r>
+        <w:rPr>
+          <w:bCs/>
+        </w:rPr>
+        <w:t>d’e-mail</w:t>
+      </w:r>
+      <w:proofErr w:type="gramEnd"/>
+      <w:r>
+        <w:rPr>
+          <w:bCs/>
+        </w:rPr>
+        <w:t xml:space="preserve"> `{{...}}`, noter la **source** (gabarit Doc/`</w:t>
+      </w:r>
+      <w:proofErr w:type="spellStart"/>
+      <w:r>
+        <w:rPr>
+          <w:bCs/>
+        </w:rPr>
+        <w:t>sys_Composition_</w:t>
+      </w:r>
+      <w:proofErr w:type="gramStart"/>
+      <w:r>
+        <w:rPr>
+          <w:bCs/>
+        </w:rPr>
+        <w:t>Emails</w:t>
+      </w:r>
+      <w:proofErr w:type="spellEnd"/>
+      <w:proofErr w:type="gramEnd"/>
+      <w:r>
+        <w:rPr>
+          <w:bCs/>
+        </w:rPr>
+        <w:t xml:space="preserve">`) et </w:t>
+      </w:r>
+      <w:proofErr w:type="gramStart"/>
+      <w:r>
+        <w:rPr>
+          <w:bCs/>
+        </w:rPr>
+        <w:t>la</w:t>
+      </w:r>
+      <w:proofErr w:type="gramEnd"/>
+      <w:r>
+        <w:rPr>
+          <w:bCs/>
+        </w:rPr>
+        <w:t xml:space="preserve"> **valeur de substitution** (ex: clé dans `</w:t>
+      </w:r>
+      <w:proofErr w:type="spellStart"/>
+      <w:r>
+        <w:rPr>
+          <w:bCs/>
+        </w:rPr>
+        <w:t>reponse</w:t>
+      </w:r>
+      <w:proofErr w:type="spellEnd"/>
+      <w:r>
+        <w:rPr>
+          <w:bCs/>
+        </w:rPr>
+        <w:t>`/`</w:t>
+      </w:r>
+      <w:proofErr w:type="spellStart"/>
+      <w:r>
+        <w:rPr>
+          <w:bCs/>
+        </w:rPr>
+        <w:t>resultats</w:t>
+      </w:r>
+      <w:proofErr w:type="spellEnd"/>
+      <w:r>
+        <w:rPr>
+          <w:bCs/>
+        </w:rPr>
+        <w:t>`).</w:t>
       </w:r>
     </w:p>
     <w:p>
@@ -1162,7 +1800,21 @@
         <w:rPr>
           <w:bCs/>
         </w:rPr>
-        <w:t>- **Ne pas inclure ce prompt** dans la sortie. La sortie attendue est **UNIQUEMENT** le document Markdown final.</w:t>
+        <w:t xml:space="preserve">- **Ne pas inclure ce prompt** dans la sortie. La sortie attendue est **UNIQUEMENT** le document </w:t>
+      </w:r>
+      <w:proofErr w:type="spellStart"/>
+      <w:r>
+        <w:rPr>
+          <w:bCs/>
+        </w:rPr>
+        <w:t>Markdown</w:t>
+      </w:r>
+      <w:proofErr w:type="spellEnd"/>
+      <w:r>
+        <w:rPr>
+          <w:bCs/>
+        </w:rPr>
+        <w:t xml:space="preserve"> final.</w:t>
       </w:r>
     </w:p>
     <w:p>
@@ -1195,27 +1847,21 @@
         <w:rPr>
           <w:bCs/>
         </w:rPr>
-        <w:t>→ Un **unique document Markdown** respectant strictement le plan et les règles ci-dessus, avec **Annexe A (Glossaire)** et **Annexe B (Registre des variables)** **fusionnées/enrichies** à partir du dernier document si fourni.</w:t>
+        <w:t xml:space="preserve">→ Un **unique document </w:t>
       </w:r>
-    </w:p>
-    <w:p>
-      <w:pPr>
+      <w:proofErr w:type="spellStart"/>
+      <w:r>
         <w:rPr>
           <w:bCs/>
         </w:rPr>
-      </w:pPr>
-    </w:p>
-    <w:p>
-      <w:pPr>
+        <w:t>Markdown</w:t>
+      </w:r>
+      <w:proofErr w:type="spellEnd"/>
+      <w:r>
         <w:rPr>
           <w:bCs/>
         </w:rPr>
-      </w:pPr>
-      <w:r>
-        <w:rPr>
-          <w:bCs/>
-        </w:rPr>
-        <w:t>À la fin de chaque document, tu devras également tenir une check-list les travaux/modification à réaliser que je te dicterais comme choses à mémoriser lors de nos sessions. L’idée est que nous nous perdions pas une information qui nous viendrait à l’esprit lors d’une session, certes on peut le reporter sur le document d’état du projet, mais si on ne traite pas durant la session suivante, il faut en garder la mémoire. C’est pour cela que je te demanderai de garder la mémoire de tout ce qu’il y a à faire que je t’aurais demandé, devra voter si je te demande de mémoriser lors d’une session un nouveau travail à faire, et de n’enlever que ce que nous aurons effectivement réalisé comme modification. Le rendu est donc une liste enfin du document état de projet de choses à faire dans le futur</w:t>
+        <w:t>** respectant strictement le plan et les règles ci-dessus, avec **Annexe A (Glossaire)** et **Annexe B (Registre des variables)** **fusionnées/enrichies** à partir du dernier document si fourni.</w:t>
       </w:r>
     </w:p>
     <w:sectPr>

</xml_diff>

<commit_message>
Backup auto 2025-09-20 21:00:25
</commit_message>
<xml_diff>
--- a/ZZ échange avec Chatgpt/00000 prompt pour  Doc État du Projet.docx
+++ b/ZZ échange avec Chatgpt/00000 prompt pour  Doc État du Projet.docx
@@ -1796,11 +1796,31 @@
           <w:bCs/>
         </w:rPr>
       </w:pPr>
+    </w:p>
+    <w:p>
+      <w:pPr>
+        <w:rPr>
+          <w:bCs/>
+        </w:rPr>
+      </w:pPr>
       <w:r>
         <w:rPr>
           <w:bCs/>
         </w:rPr>
-        <w:t xml:space="preserve">- **Ne pas inclure ce prompt** dans la sortie. La sortie attendue est **UNIQUEMENT** le document </w:t>
+        <w:t># Sortie attendue</w:t>
+      </w:r>
+    </w:p>
+    <w:p>
+      <w:pPr>
+        <w:rPr>
+          <w:bCs/>
+        </w:rPr>
+      </w:pPr>
+      <w:r>
+        <w:rPr>
+          <w:bCs/>
+        </w:rPr>
+        <w:t xml:space="preserve">→ Un **unique document </w:t>
       </w:r>
       <w:proofErr w:type="spellStart"/>
       <w:r>
@@ -1814,55 +1834,204 @@
         <w:rPr>
           <w:bCs/>
         </w:rPr>
-        <w:t xml:space="preserve"> final.</w:t>
+        <w:t>** respectant strictement le plan et les règles ci-dessus, avec **Annexe A (Glossaire)** et **Annexe B (Registre des variables)** **fusionnées/enrichies** à partir du dernier document si fourni.</w:t>
+      </w:r>
+      <w:r>
+        <w:rPr>
+          <w:bCs/>
+        </w:rPr>
+        <w:br/>
+      </w:r>
+      <w:r>
+        <w:rPr>
+          <w:bCs/>
+        </w:rPr>
+        <w:br/>
+        <w:t>à la fin du document : rappel pour la session suivante les consignes :</w:t>
       </w:r>
     </w:p>
     <w:p>
       <w:pPr>
         <w:rPr>
+          <w:b/>
           <w:bCs/>
-        </w:rPr>
-      </w:pPr>
-    </w:p>
-    <w:p>
-      <w:pPr>
-        <w:rPr>
+          <w:lang w:val="fr-FR"/>
+        </w:rPr>
+      </w:pPr>
+      <w:r>
+        <w:rPr>
+          <w:b/>
           <w:bCs/>
-        </w:rPr>
-      </w:pPr>
-      <w:r>
-        <w:rPr>
-          <w:bCs/>
-        </w:rPr>
-        <w:t># Sortie attendue</w:t>
+          <w:lang w:val="fr-FR"/>
+        </w:rPr>
+        <w:t>Comment on travaille</w:t>
       </w:r>
     </w:p>
     <w:p>
       <w:pPr>
-        <w:rPr>
+        <w:numPr>
+          <w:ilvl w:val="0"/>
+          <w:numId w:val="190"/>
+        </w:numPr>
+        <w:rPr>
+          <w:lang w:val="fr-FR"/>
+        </w:rPr>
+      </w:pPr>
+      <w:r>
+        <w:rPr>
+          <w:b/>
           <w:bCs/>
-        </w:rPr>
-      </w:pPr>
+          <w:lang w:val="fr-FR"/>
+        </w:rPr>
+        <w:t>Une seule consigne à la fois</w:t>
+      </w:r>
       <w:r>
         <w:rPr>
+          <w:lang w:val="fr-FR"/>
+        </w:rPr>
+        <w:t>, détaillée et concise.</w:t>
+      </w:r>
+    </w:p>
+    <w:p>
+      <w:pPr>
+        <w:numPr>
+          <w:ilvl w:val="0"/>
+          <w:numId w:val="190"/>
+        </w:numPr>
+        <w:rPr>
+          <w:lang w:val="fr-FR"/>
+        </w:rPr>
+      </w:pPr>
+      <w:r>
+        <w:rPr>
+          <w:lang w:val="fr-FR"/>
+        </w:rPr>
+        <w:t xml:space="preserve">Je </w:t>
+      </w:r>
+      <w:r>
+        <w:rPr>
+          <w:b/>
           <w:bCs/>
-        </w:rPr>
-        <w:t xml:space="preserve">→ Un **unique document </w:t>
+          <w:lang w:val="fr-FR"/>
+        </w:rPr>
+        <w:t>décode le vocabulaire technique</w:t>
       </w:r>
-      <w:proofErr w:type="spellStart"/>
       <w:r>
         <w:rPr>
+          <w:lang w:val="fr-FR"/>
+        </w:rPr>
+        <w:t xml:space="preserve"> (</w:t>
+      </w:r>
+      <w:proofErr w:type="gramStart"/>
+      <w:r>
+        <w:rPr>
+          <w:lang w:val="fr-FR"/>
+        </w:rPr>
+        <w:t>non programmeur</w:t>
+      </w:r>
+      <w:proofErr w:type="gramEnd"/>
+      <w:r>
+        <w:rPr>
+          <w:lang w:val="fr-FR"/>
+        </w:rPr>
+        <w:t>).</w:t>
+      </w:r>
+    </w:p>
+    <w:p>
+      <w:pPr>
+        <w:numPr>
+          <w:ilvl w:val="0"/>
+          <w:numId w:val="190"/>
+        </w:numPr>
+        <w:rPr>
+          <w:lang w:val="fr-FR"/>
+        </w:rPr>
+      </w:pPr>
+      <w:r>
+        <w:rPr>
+          <w:lang w:val="fr-FR"/>
+        </w:rPr>
+        <w:t xml:space="preserve">À chaque consigne, j’indique </w:t>
+      </w:r>
+      <w:r>
+        <w:rPr>
+          <w:b/>
           <w:bCs/>
-        </w:rPr>
-        <w:t>Markdown</w:t>
+          <w:lang w:val="fr-FR"/>
+        </w:rPr>
+        <w:t>le nom de l’étape suivante</w:t>
       </w:r>
-      <w:proofErr w:type="spellEnd"/>
       <w:r>
         <w:rPr>
+          <w:lang w:val="fr-FR"/>
+        </w:rPr>
+        <w:t xml:space="preserve"> (juste le nom, pas le détail).</w:t>
+      </w:r>
+    </w:p>
+    <w:p>
+      <w:pPr>
+        <w:rPr>
+          <w:b/>
           <w:bCs/>
-        </w:rPr>
-        <w:t>** respectant strictement le plan et les règles ci-dessus, avec **Annexe A (Glossaire)** et **Annexe B (Registre des variables)** **fusionnées/enrichies** à partir du dernier document si fourni.</w:t>
+          <w:lang w:val="fr-FR"/>
+        </w:rPr>
+      </w:pPr>
+      <w:r>
+        <w:rPr>
+          <w:b/>
+          <w:bCs/>
+          <w:lang w:val="fr-FR"/>
+        </w:rPr>
+        <w:t>1) But du projet</w:t>
       </w:r>
+    </w:p>
+    <w:p>
+      <w:pPr>
+        <w:rPr>
+          <w:lang w:val="fr-FR"/>
+        </w:rPr>
+      </w:pPr>
+      <w:r>
+        <w:rPr>
+          <w:lang w:val="fr-FR"/>
+        </w:rPr>
+        <w:t xml:space="preserve">Créer un </w:t>
+      </w:r>
+      <w:r>
+        <w:rPr>
+          <w:b/>
+          <w:bCs/>
+          <w:lang w:val="fr-FR"/>
+        </w:rPr>
+        <w:t>logiciel expert r&amp;K</w:t>
+      </w:r>
+      <w:r>
+        <w:rPr>
+          <w:lang w:val="fr-FR"/>
+        </w:rPr>
+        <w:t xml:space="preserve"> piloté par les données : questionnaires → calculs (r/K + génériques) → recommandations → </w:t>
+      </w:r>
+      <w:proofErr w:type="gramStart"/>
+      <w:r>
+        <w:rPr>
+          <w:lang w:val="fr-FR"/>
+        </w:rPr>
+        <w:t>e-mails</w:t>
+      </w:r>
+      <w:proofErr w:type="gramEnd"/>
+      <w:r>
+        <w:rPr>
+          <w:lang w:val="fr-FR"/>
+        </w:rPr>
+        <w:t xml:space="preserve"> + PDF multilingues → (paiement optionnel).</w:t>
+      </w:r>
+    </w:p>
+    <w:p>
+      <w:pPr>
+        <w:rPr>
+          <w:bCs/>
+        </w:rPr>
+      </w:pPr>
     </w:p>
     <w:sectPr>
       <w:pgSz w:w="11906" w:h="16838"/>
@@ -25900,6 +26069,155 @@
     </w:lvl>
   </w:abstractNum>
   <w:abstractNum w:abstractNumId="167" w15:restartNumberingAfterBreak="0">
+    <w:nsid w:val="7D811F66"/>
+    <w:multiLevelType w:val="multilevel"/>
+    <w:tmpl w:val="6510AC00"/>
+    <w:lvl w:ilvl="0">
+      <w:start w:val="1"/>
+      <w:numFmt w:val="bullet"/>
+      <w:lvlText w:val=""/>
+      <w:lvlJc w:val="left"/>
+      <w:pPr>
+        <w:tabs>
+          <w:tab w:val="num" w:pos="720"/>
+        </w:tabs>
+        <w:ind w:left="720" w:hanging="360"/>
+      </w:pPr>
+      <w:rPr>
+        <w:rFonts w:ascii="Symbol" w:hAnsi="Symbol" w:hint="default"/>
+        <w:sz w:val="20"/>
+      </w:rPr>
+    </w:lvl>
+    <w:lvl w:ilvl="1" w:tentative="1">
+      <w:start w:val="1"/>
+      <w:numFmt w:val="bullet"/>
+      <w:lvlText w:val="o"/>
+      <w:lvlJc w:val="left"/>
+      <w:pPr>
+        <w:tabs>
+          <w:tab w:val="num" w:pos="1440"/>
+        </w:tabs>
+        <w:ind w:left="1440" w:hanging="360"/>
+      </w:pPr>
+      <w:rPr>
+        <w:rFonts w:ascii="Courier New" w:hAnsi="Courier New" w:hint="default"/>
+        <w:sz w:val="20"/>
+      </w:rPr>
+    </w:lvl>
+    <w:lvl w:ilvl="2" w:tentative="1">
+      <w:start w:val="1"/>
+      <w:numFmt w:val="bullet"/>
+      <w:lvlText w:val=""/>
+      <w:lvlJc w:val="left"/>
+      <w:pPr>
+        <w:tabs>
+          <w:tab w:val="num" w:pos="2160"/>
+        </w:tabs>
+        <w:ind w:left="2160" w:hanging="360"/>
+      </w:pPr>
+      <w:rPr>
+        <w:rFonts w:ascii="Wingdings" w:hAnsi="Wingdings" w:hint="default"/>
+        <w:sz w:val="20"/>
+      </w:rPr>
+    </w:lvl>
+    <w:lvl w:ilvl="3" w:tentative="1">
+      <w:start w:val="1"/>
+      <w:numFmt w:val="bullet"/>
+      <w:lvlText w:val=""/>
+      <w:lvlJc w:val="left"/>
+      <w:pPr>
+        <w:tabs>
+          <w:tab w:val="num" w:pos="2880"/>
+        </w:tabs>
+        <w:ind w:left="2880" w:hanging="360"/>
+      </w:pPr>
+      <w:rPr>
+        <w:rFonts w:ascii="Wingdings" w:hAnsi="Wingdings" w:hint="default"/>
+        <w:sz w:val="20"/>
+      </w:rPr>
+    </w:lvl>
+    <w:lvl w:ilvl="4" w:tentative="1">
+      <w:start w:val="1"/>
+      <w:numFmt w:val="bullet"/>
+      <w:lvlText w:val=""/>
+      <w:lvlJc w:val="left"/>
+      <w:pPr>
+        <w:tabs>
+          <w:tab w:val="num" w:pos="3600"/>
+        </w:tabs>
+        <w:ind w:left="3600" w:hanging="360"/>
+      </w:pPr>
+      <w:rPr>
+        <w:rFonts w:ascii="Wingdings" w:hAnsi="Wingdings" w:hint="default"/>
+        <w:sz w:val="20"/>
+      </w:rPr>
+    </w:lvl>
+    <w:lvl w:ilvl="5" w:tentative="1">
+      <w:start w:val="1"/>
+      <w:numFmt w:val="bullet"/>
+      <w:lvlText w:val=""/>
+      <w:lvlJc w:val="left"/>
+      <w:pPr>
+        <w:tabs>
+          <w:tab w:val="num" w:pos="4320"/>
+        </w:tabs>
+        <w:ind w:left="4320" w:hanging="360"/>
+      </w:pPr>
+      <w:rPr>
+        <w:rFonts w:ascii="Wingdings" w:hAnsi="Wingdings" w:hint="default"/>
+        <w:sz w:val="20"/>
+      </w:rPr>
+    </w:lvl>
+    <w:lvl w:ilvl="6" w:tentative="1">
+      <w:start w:val="1"/>
+      <w:numFmt w:val="bullet"/>
+      <w:lvlText w:val=""/>
+      <w:lvlJc w:val="left"/>
+      <w:pPr>
+        <w:tabs>
+          <w:tab w:val="num" w:pos="5040"/>
+        </w:tabs>
+        <w:ind w:left="5040" w:hanging="360"/>
+      </w:pPr>
+      <w:rPr>
+        <w:rFonts w:ascii="Wingdings" w:hAnsi="Wingdings" w:hint="default"/>
+        <w:sz w:val="20"/>
+      </w:rPr>
+    </w:lvl>
+    <w:lvl w:ilvl="7" w:tentative="1">
+      <w:start w:val="1"/>
+      <w:numFmt w:val="bullet"/>
+      <w:lvlText w:val=""/>
+      <w:lvlJc w:val="left"/>
+      <w:pPr>
+        <w:tabs>
+          <w:tab w:val="num" w:pos="5760"/>
+        </w:tabs>
+        <w:ind w:left="5760" w:hanging="360"/>
+      </w:pPr>
+      <w:rPr>
+        <w:rFonts w:ascii="Wingdings" w:hAnsi="Wingdings" w:hint="default"/>
+        <w:sz w:val="20"/>
+      </w:rPr>
+    </w:lvl>
+    <w:lvl w:ilvl="8" w:tentative="1">
+      <w:start w:val="1"/>
+      <w:numFmt w:val="bullet"/>
+      <w:lvlText w:val=""/>
+      <w:lvlJc w:val="left"/>
+      <w:pPr>
+        <w:tabs>
+          <w:tab w:val="num" w:pos="6480"/>
+        </w:tabs>
+        <w:ind w:left="6480" w:hanging="360"/>
+      </w:pPr>
+      <w:rPr>
+        <w:rFonts w:ascii="Wingdings" w:hAnsi="Wingdings" w:hint="default"/>
+        <w:sz w:val="20"/>
+      </w:rPr>
+    </w:lvl>
+  </w:abstractNum>
+  <w:abstractNum w:abstractNumId="168" w15:restartNumberingAfterBreak="0">
     <w:nsid w:val="7E5315A9"/>
     <w:multiLevelType w:val="multilevel"/>
     <w:tmpl w:val="63760288"/>
@@ -26016,7 +26334,7 @@
       </w:pPr>
     </w:lvl>
   </w:abstractNum>
-  <w:abstractNum w:abstractNumId="168" w15:restartNumberingAfterBreak="0">
+  <w:abstractNum w:abstractNumId="169" w15:restartNumberingAfterBreak="0">
     <w:nsid w:val="7E845D03"/>
     <w:multiLevelType w:val="multilevel"/>
     <w:tmpl w:val="22FA3D84"/>
@@ -26165,7 +26483,7 @@
       </w:rPr>
     </w:lvl>
   </w:abstractNum>
-  <w:abstractNum w:abstractNumId="169" w15:restartNumberingAfterBreak="0">
+  <w:abstractNum w:abstractNumId="170" w15:restartNumberingAfterBreak="0">
     <w:nsid w:val="7F9A1358"/>
     <w:multiLevelType w:val="multilevel"/>
     <w:tmpl w:val="818C7948"/>
@@ -26330,7 +26648,7 @@
     <w:abstractNumId w:val="102"/>
   </w:num>
   <w:num w:numId="18" w16cid:durableId="773331749">
-    <w:abstractNumId w:val="168"/>
+    <w:abstractNumId w:val="169"/>
   </w:num>
   <w:num w:numId="19" w16cid:durableId="791021393">
     <w:abstractNumId w:val="46"/>
@@ -26890,7 +27208,7 @@
     <w:abstractNumId w:val="15"/>
   </w:num>
   <w:num w:numId="131" w16cid:durableId="305207024">
-    <w:abstractNumId w:val="169"/>
+    <w:abstractNumId w:val="170"/>
   </w:num>
   <w:num w:numId="132" w16cid:durableId="303120880">
     <w:abstractNumId w:val="50"/>
@@ -26920,7 +27238,7 @@
     <w:abstractNumId w:val="131"/>
   </w:num>
   <w:num w:numId="141" w16cid:durableId="1124225954">
-    <w:abstractNumId w:val="167"/>
+    <w:abstractNumId w:val="168"/>
   </w:num>
   <w:num w:numId="142" w16cid:durableId="1428883756">
     <w:abstractNumId w:val="137"/>
@@ -27105,6 +27423,9 @@
   </w:num>
   <w:num w:numId="189" w16cid:durableId="1289049802">
     <w:abstractNumId w:val="80"/>
+  </w:num>
+  <w:num w:numId="190" w16cid:durableId="271665483">
+    <w:abstractNumId w:val="167"/>
   </w:num>
 </w:numbering>
 </file>

</xml_diff>

<commit_message>
Backup auto 2025-09-26 12:15:47
</commit_message>
<xml_diff>
--- a/ZZ échange avec Chatgpt/00000 prompt pour  Doc État du Projet.docx
+++ b/ZZ échange avec Chatgpt/00000 prompt pour  Doc État du Projet.docx
@@ -1847,7 +1847,44 @@
           <w:bCs/>
         </w:rPr>
         <w:br/>
-        <w:t>à la fin du document : rappel pour la session suivante les consignes :</w:t>
+      </w:r>
+      <w:r>
+        <w:rPr>
+          <w:bCs/>
+        </w:rPr>
+        <w:t xml:space="preserve">en </w:t>
+      </w:r>
+      <w:proofErr w:type="gramStart"/>
+      <w:r>
+        <w:rPr>
+          <w:bCs/>
+        </w:rPr>
+        <w:t xml:space="preserve">début </w:t>
+      </w:r>
+      <w:r>
+        <w:rPr>
+          <w:bCs/>
+        </w:rPr>
+        <w:t xml:space="preserve"> du</w:t>
+      </w:r>
+      <w:proofErr w:type="gramEnd"/>
+      <w:r>
+        <w:rPr>
+          <w:bCs/>
+        </w:rPr>
+        <w:t xml:space="preserve"> document : rappel pour la session suivante les consignes</w:t>
+      </w:r>
+      <w:r>
+        <w:rPr>
+          <w:bCs/>
+        </w:rPr>
+        <w:t xml:space="preserve"> impératives</w:t>
+      </w:r>
+      <w:r>
+        <w:rPr>
+          <w:bCs/>
+        </w:rPr>
+        <w:t> :</w:t>
       </w:r>
     </w:p>
     <w:p>
@@ -2003,13 +2040,13 @@
           <w:bCs/>
           <w:lang w:val="fr-FR"/>
         </w:rPr>
-        <w:t>logiciel expert r&amp;K</w:t>
+        <w:t xml:space="preserve">logiciel expert </w:t>
       </w:r>
       <w:r>
         <w:rPr>
           <w:lang w:val="fr-FR"/>
         </w:rPr>
-        <w:t xml:space="preserve"> piloté par les données : questionnaires → calculs (r/K + génériques) → recommandations → </w:t>
+        <w:t xml:space="preserve">piloté par les données : questionnaires → calculs (r/K + génériques) → recommandations → </w:t>
       </w:r>
       <w:proofErr w:type="gramStart"/>
       <w:r>

</xml_diff>

<commit_message>
Backup auto 2025-09-27 12:23:19
</commit_message>
<xml_diff>
--- a/ZZ échange avec Chatgpt/00000 prompt pour  Doc État du Projet.docx
+++ b/ZZ échange avec Chatgpt/00000 prompt pour  Doc État du Projet.docx
@@ -943,38 +943,16 @@
         <w:rPr>
           <w:bCs/>
         </w:rPr>
-        <w:t xml:space="preserve">   - Gabarits </w:t>
-      </w:r>
-      <w:proofErr w:type="gramStart"/>
-      <w:r>
-        <w:rPr>
-          <w:bCs/>
-        </w:rPr>
-        <w:t>emails</w:t>
-      </w:r>
-      <w:proofErr w:type="gramEnd"/>
-      <w:r>
-        <w:rPr>
-          <w:bCs/>
-        </w:rPr>
-        <w:t>, `</w:t>
+        <w:t xml:space="preserve">   - Gabarits emails, `</w:t>
       </w:r>
       <w:proofErr w:type="spellStart"/>
       <w:r>
         <w:rPr>
           <w:bCs/>
         </w:rPr>
-        <w:t>sys_Composition_</w:t>
-      </w:r>
-      <w:proofErr w:type="gramStart"/>
-      <w:r>
-        <w:rPr>
-          <w:bCs/>
-        </w:rPr>
-        <w:t>Emails</w:t>
+        <w:t>sys_Composition_Emails</w:t>
       </w:r>
       <w:proofErr w:type="spellEnd"/>
-      <w:proofErr w:type="gramEnd"/>
       <w:r>
         <w:rPr>
           <w:bCs/>
@@ -1365,21 +1343,7 @@
         <w:rPr>
           <w:bCs/>
         </w:rPr>
-        <w:t xml:space="preserve"> </w:t>
-      </w:r>
-      <w:proofErr w:type="gramStart"/>
-      <w:r>
-        <w:rPr>
-          <w:bCs/>
-        </w:rPr>
-        <w:t>d’emails</w:t>
-      </w:r>
-      <w:proofErr w:type="gramEnd"/>
-      <w:r>
-        <w:rPr>
-          <w:bCs/>
-        </w:rPr>
-        <w:t>).</w:t>
+        <w:t xml:space="preserve"> d’emails).</w:t>
       </w:r>
     </w:p>
     <w:p>
@@ -1399,21 +1363,7 @@
         <w:rPr>
           <w:bCs/>
         </w:rPr>
-        <w:t>ID_Gabarit_</w:t>
-      </w:r>
-      <w:proofErr w:type="gramStart"/>
-      <w:r>
-        <w:rPr>
-          <w:bCs/>
-        </w:rPr>
-        <w:t>Email</w:t>
-      </w:r>
-      <w:proofErr w:type="gramEnd"/>
-      <w:r>
-        <w:rPr>
-          <w:bCs/>
-        </w:rPr>
-        <w:t>_Repondant</w:t>
+        <w:t>ID_Gabarit_Email_Repondant</w:t>
       </w:r>
       <w:proofErr w:type="spellEnd"/>
       <w:r>
@@ -1650,57 +1600,21 @@
         <w:rPr>
           <w:bCs/>
         </w:rPr>
-        <w:t xml:space="preserve"> </w:t>
-      </w:r>
-      <w:proofErr w:type="gramStart"/>
-      <w:r>
-        <w:rPr>
-          <w:bCs/>
-        </w:rPr>
-        <w:t>d’e-mail</w:t>
-      </w:r>
-      <w:proofErr w:type="gramEnd"/>
-      <w:r>
-        <w:rPr>
-          <w:bCs/>
-        </w:rPr>
-        <w:t xml:space="preserve"> `{{...}}`, noter la **source** (gabarit Doc/`</w:t>
+        <w:t xml:space="preserve"> d’e-mail `{{...}}`, noter la **source** (gabarit Doc/`</w:t>
       </w:r>
       <w:proofErr w:type="spellStart"/>
       <w:r>
         <w:rPr>
           <w:bCs/>
         </w:rPr>
-        <w:t>sys_Composition_</w:t>
-      </w:r>
-      <w:proofErr w:type="gramStart"/>
-      <w:r>
-        <w:rPr>
-          <w:bCs/>
-        </w:rPr>
-        <w:t>Emails</w:t>
+        <w:t>sys_Composition_Emails</w:t>
       </w:r>
       <w:proofErr w:type="spellEnd"/>
-      <w:proofErr w:type="gramEnd"/>
       <w:r>
         <w:rPr>
           <w:bCs/>
         </w:rPr>
-        <w:t xml:space="preserve">`) et </w:t>
-      </w:r>
-      <w:proofErr w:type="gramStart"/>
-      <w:r>
-        <w:rPr>
-          <w:bCs/>
-        </w:rPr>
-        <w:t>la</w:t>
-      </w:r>
-      <w:proofErr w:type="gramEnd"/>
-      <w:r>
-        <w:rPr>
-          <w:bCs/>
-        </w:rPr>
-        <w:t xml:space="preserve"> **valeur de substitution** (ex: clé dans `</w:t>
+        <w:t>`) et la **valeur de substitution** (ex: clé dans `</w:t>
       </w:r>
       <w:proofErr w:type="spellStart"/>
       <w:r>
@@ -1852,27 +1766,13 @@
         <w:rPr>
           <w:bCs/>
         </w:rPr>
-        <w:t xml:space="preserve">en </w:t>
-      </w:r>
-      <w:proofErr w:type="gramStart"/>
-      <w:r>
-        <w:rPr>
-          <w:bCs/>
-        </w:rPr>
-        <w:t xml:space="preserve">début </w:t>
+        <w:t xml:space="preserve">en début </w:t>
       </w:r>
       <w:r>
         <w:rPr>
           <w:bCs/>
         </w:rPr>
-        <w:t xml:space="preserve"> du</w:t>
-      </w:r>
-      <w:proofErr w:type="gramEnd"/>
-      <w:r>
-        <w:rPr>
-          <w:bCs/>
-        </w:rPr>
-        <w:t xml:space="preserve"> document : rappel pour la session suivante les consignes</w:t>
+        <w:t xml:space="preserve"> du document : rappel pour la session suivante les consignes</w:t>
       </w:r>
       <w:r>
         <w:rPr>
@@ -1892,7 +1792,6 @@
         <w:rPr>
           <w:b/>
           <w:bCs/>
-          <w:lang w:val="fr-FR"/>
         </w:rPr>
       </w:pPr>
       <w:r>
@@ -1902,6 +1801,50 @@
           <w:lang w:val="fr-FR"/>
         </w:rPr>
         <w:t>Comment on travaille</w:t>
+      </w:r>
+      <w:r>
+        <w:rPr>
+          <w:b/>
+          <w:bCs/>
+          <w:lang w:val="fr-FR"/>
+        </w:rPr>
+        <w:t>.</w:t>
+      </w:r>
+      <w:r>
+        <w:rPr>
+          <w:b/>
+          <w:bCs/>
+          <w:lang w:val="fr-FR"/>
+        </w:rPr>
+        <w:br/>
+      </w:r>
+      <w:r>
+        <w:rPr>
+          <w:b/>
+          <w:bCs/>
+        </w:rPr>
+        <w:t>Reprendre connaissance du dossier, tu vois à travers les documents que je t'ai donnés tous les scripts et tous les fichiers qui constituent cette application, si nécessaire demande-moi de te les fournir</w:t>
+      </w:r>
+    </w:p>
+    <w:p>
+      <w:pPr>
+        <w:rPr>
+          <w:b/>
+          <w:bCs/>
+          <w:lang w:val="fr-FR"/>
+        </w:rPr>
+      </w:pPr>
+      <w:r>
+        <w:rPr>
+          <w:bCs/>
+        </w:rPr>
+        <w:t>les consignes impératives</w:t>
+      </w:r>
+      <w:r>
+        <w:rPr>
+          <w:bCs/>
+        </w:rPr>
+        <w:t> :</w:t>
       </w:r>
     </w:p>
     <w:p>
@@ -1957,21 +1900,7 @@
         <w:rPr>
           <w:lang w:val="fr-FR"/>
         </w:rPr>
-        <w:t xml:space="preserve"> (</w:t>
-      </w:r>
-      <w:proofErr w:type="gramStart"/>
-      <w:r>
-        <w:rPr>
-          <w:lang w:val="fr-FR"/>
-        </w:rPr>
-        <w:t>non programmeur</w:t>
-      </w:r>
-      <w:proofErr w:type="gramEnd"/>
-      <w:r>
-        <w:rPr>
-          <w:lang w:val="fr-FR"/>
-        </w:rPr>
-        <w:t>).</w:t>
+        <w:t xml:space="preserve"> (non programmeur).</w:t>
       </w:r>
     </w:p>
     <w:p>
@@ -2046,21 +1975,7 @@
         <w:rPr>
           <w:lang w:val="fr-FR"/>
         </w:rPr>
-        <w:t xml:space="preserve">piloté par les données : questionnaires → calculs (r/K + génériques) → recommandations → </w:t>
-      </w:r>
-      <w:proofErr w:type="gramStart"/>
-      <w:r>
-        <w:rPr>
-          <w:lang w:val="fr-FR"/>
-        </w:rPr>
-        <w:t>e-mails</w:t>
-      </w:r>
-      <w:proofErr w:type="gramEnd"/>
-      <w:r>
-        <w:rPr>
-          <w:lang w:val="fr-FR"/>
-        </w:rPr>
-        <w:t xml:space="preserve"> + PDF multilingues → (paiement optionnel).</w:t>
+        <w:t>piloté par les données : questionnaires → calculs (r/K + génériques) → recommandations → e-mails + PDF multilingues → (paiement optionnel).</w:t>
       </w:r>
     </w:p>
     <w:p>
@@ -28090,7 +28005,6 @@
   <w:style w:type="character" w:default="1" w:styleId="Policepardfaut">
     <w:name w:val="Default Paragraph Font"/>
     <w:uiPriority w:val="1"/>
-    <w:semiHidden/>
     <w:unhideWhenUsed/>
   </w:style>
   <w:style w:type="table" w:default="1" w:styleId="TableauNormal">

</xml_diff>